<commit_message>
Updated AVCDL Phase Requirement Product ISO 26262 Work Product Fulfillment Summary (corrected a typo)
</commit_message>
<xml_diff>
--- a/source/reference_documents/certification_documents/AVCDL Phase Requirement Product ISO 26262 Work Product Fulfillment Summary/AVCDL Phase Requirement Product ISO 26262 Work Product Fulfillment Summary.docx
+++ b/source/reference_documents/certification_documents/AVCDL Phase Requirement Product ISO 26262 Work Product Fulfillment Summary/AVCDL Phase Requirement Product ISO 26262 Work Product Fulfillment Summary.docx
@@ -37,7 +37,7 @@
         <w:t xml:space="preserve">Version </w:t>
       </w:r>
       <w:r>
-        <w:t>5</w:t>
+        <w:t>6</w:t>
       </w:r>
     </w:p>
     <w:p>
@@ -54,7 +54,7 @@
         <w:rPr>
           <w:noProof/>
         </w:rPr>
-        <w:t>4/11/25 2:44 PM</w:t>
+        <w:t>6/30/26 7:43 AM</w:t>
       </w:r>
       <w:r>
         <w:fldChar w:fldCharType="end"/>
@@ -258,7 +258,19 @@
         <w:rPr>
           <w:lang w:val="en-US"/>
         </w:rPr>
-        <w:t xml:space="preserve">was created by </w:t>
+        <w:t>was</w:t>
+      </w:r>
+      <w:r>
+        <w:rPr>
+          <w:lang w:val="en-US"/>
+        </w:rPr>
+        <w:t xml:space="preserve"> originally</w:t>
+      </w:r>
+      <w:r>
+        <w:rPr>
+          <w:lang w:val="en-US"/>
+        </w:rPr>
+        <w:t xml:space="preserve"> created by </w:t>
       </w:r>
       <w:r>
         <w:rPr>
@@ -3457,7 +3469,19 @@
         <w:rPr>
           <w:lang w:val="en-US"/>
         </w:rPr>
-        <w:t xml:space="preserve">. It is presumed that this information would be documented at non-functional safety requirements attached to their corresponding functional requirements or as safety notes attached to the functional design documentation. This information is presumed to be available to cybersecurity per </w:t>
+        <w:t>. It is presumed that this information would be documented a</w:t>
+      </w:r>
+      <w:r>
+        <w:rPr>
+          <w:lang w:val="en-US"/>
+        </w:rPr>
+        <w:t>s</w:t>
+      </w:r>
+      <w:r>
+        <w:rPr>
+          <w:lang w:val="en-US"/>
+        </w:rPr>
+        <w:t xml:space="preserve"> non-functional safety requirements attached to their corresponding functional requirements or as safety notes attached to the functional design documentation. This information is presumed to be available to cybersecurity per </w:t>
       </w:r>
       <w:r>
         <w:rPr>

</xml_diff>